<commit_message>
PRD: re-sync from Google Doc
</commit_message>
<xml_diff>
--- a/WC26-Terminal-PRD.docx
+++ b/WC26-Terminal-PRD.docx
@@ -37,17 +37,13 @@
         <w:spacing w:after="200" w:lineRule="auto"/>
         <w:rPr>
           <w:rFonts w:ascii="Calibri" w:cs="Calibri" w:eastAsia="Calibri" w:hAnsi="Calibri"/>
-          <w:i w:val="1"/>
-          <w:iCs w:val="1"/>
-          <w:sz w:val="18"/>
-          <w:szCs w:val="18"/>
-        </w:rPr>
-      </w:pPr>
-      <w:r>
-        <w:rPr>
-          <w:rFonts w:ascii="Calibri" w:cs="Calibri" w:eastAsia="Calibri" w:hAnsi="Calibri"/>
-          <w:i w:val="1"/>
-          <w:iCs w:val="1"/>
+          <w:sz w:val="18"/>
+          <w:szCs w:val="18"/>
+        </w:rPr>
+      </w:pPr>
+      <w:r>
+        <w:rPr>
+          <w:rFonts w:ascii="Calibri" w:cs="Calibri" w:eastAsia="Calibri" w:hAnsi="Calibri"/>
           <w:color w:val="555555"/>
           <w:sz w:val="18"/>
           <w:szCs w:val="18"/>
@@ -58,8 +54,6 @@
       <w:r>
         <w:rPr>
           <w:rFonts w:ascii="Calibri" w:cs="Calibri" w:eastAsia="Calibri" w:hAnsi="Calibri"/>
-          <w:i w:val="1"/>
-          <w:iCs w:val="1"/>
           <w:color w:val="1f3a5f"/>
           <w:sz w:val="18"/>
           <w:szCs w:val="18"/>
@@ -70,15 +64,60 @@
       <w:r>
         <w:rPr>
           <w:rFonts w:ascii="Calibri" w:cs="Calibri" w:eastAsia="Calibri" w:hAnsi="Calibri"/>
-          <w:i w:val="1"/>
-          <w:iCs w:val="1"/>
           <w:color w:val="555555"/>
           <w:sz w:val="18"/>
           <w:szCs w:val="18"/>
           <w:rtl w:val="0"/>
         </w:rPr>
-        <w:t xml:space="preserve">  ·  Author: Keshav Manjrekar</w:t>
-      </w:r>
+        <w:t xml:space="preserve">  ·  Author: </w:t>
+      </w:r>
+      <w:hyperlink r:id="rId7">
+        <w:r>
+          <w:rPr>
+            <w:rFonts w:ascii="Calibri" w:cs="Calibri" w:eastAsia="Calibri" w:hAnsi="Calibri"/>
+            <w:color w:val="0000ee"/>
+            <w:sz w:val="18"/>
+            <w:szCs w:val="18"/>
+            <w:u w:val="single"/>
+            <w:rtl w:val="0"/>
+          </w:rPr>
+          <w:t xml:space="preserve">Keshav Manjrekar</w:t>
+        </w:r>
+      </w:hyperlink>
+      <w:r>
+        <w:rPr>
+          <w:rFonts w:ascii="Calibri" w:cs="Calibri" w:eastAsia="Calibri" w:hAnsi="Calibri"/>
+          <w:color w:val="555555"/>
+          <w:sz w:val="18"/>
+          <w:szCs w:val="18"/>
+          <w:rtl w:val="0"/>
+        </w:rPr>
+        <w:t xml:space="preserve"> ·  Status: </w:t>
+      </w:r>
+      <w:sdt>
+        <w:sdtPr>
+          <w:alias w:val="Review status"/>
+          <w:id w:val="-517405855"/>
+          <w:dropDownList w:lastValue="Final">
+            <w:listItem w:displayText="Not started" w:value="Not started"/>
+            <w:listItem w:displayText="In progress" w:value="In progress"/>
+            <w:listItem w:displayText="Under review" w:value="Under review"/>
+            <w:listItem w:displayText="Final" w:value="Final"/>
+          </w:dropDownList>
+        </w:sdtPr>
+        <w:sdtContent>
+          <w:r>
+            <w:rPr>
+              <w:rFonts w:ascii="Calibri" w:cs="Calibri" w:eastAsia="Calibri" w:hAnsi="Calibri"/>
+              <w:color w:val="11734b"/>
+              <w:sz w:val="18"/>
+              <w:szCs w:val="18"/>
+              <w:shd w:fill="d4edbc" w:val="clear"/>
+            </w:rPr>
+            <w:t xml:space="preserve">Final</w:t>
+          </w:r>
+        </w:sdtContent>
+      </w:sdt>
       <w:r>
         <w:rPr>
           <w:rtl w:val="0"/>
@@ -535,25 +574,6 @@
           <w:rtl w:val="0"/>
         </w:rPr>
         <w:t xml:space="preserve"> win/title odds are rarely shown with an honest source, mixing model guesses and market prices without saying which.</w:t>
-      </w:r>
-    </w:p>
-    <w:p>
-      <w:pPr>
-        <w:spacing w:after="120" w:lineRule="auto"/>
-        <w:rPr>
-          <w:rFonts w:ascii="Calibri" w:cs="Calibri" w:eastAsia="Calibri" w:hAnsi="Calibri"/>
-          <w:sz w:val="18"/>
-          <w:szCs w:val="18"/>
-        </w:rPr>
-      </w:pPr>
-      <w:r>
-        <w:rPr>
-          <w:rFonts w:ascii="Calibri" w:cs="Calibri" w:eastAsia="Calibri" w:hAnsi="Calibri"/>
-          <w:sz w:val="18"/>
-          <w:szCs w:val="18"/>
-          <w:rtl w:val="0"/>
-        </w:rPr>
-        <w:t xml:space="preserve">WC26 Terminal consolidates all of this into one edge-served page: computed-from-results standings and bracket (so they are always internally consistent), live scores, and prediction-market title odds — with the data source labelled so the numbers can be trusted. As a portfolio project, it also demonstrates end-to-end product and engineering judgement.</w:t>
       </w:r>
     </w:p>
     <w:p>
@@ -2088,7 +2108,7 @@
                     <pic:cNvPicPr preferRelativeResize="0"/>
                   </pic:nvPicPr>
                   <pic:blipFill>
-                    <a:blip r:embed="rId7"/>
+                    <a:blip r:embed="rId8"/>
                     <a:srcRect b="0" l="0" r="0" t="0"/>
                     <a:stretch>
                       <a:fillRect/>
@@ -4802,7 +4822,7 @@
       </w:r>
     </w:p>
     <w:sectPr>
-      <w:footerReference r:id="rId8" w:type="default"/>
+      <w:footerReference r:id="rId9" w:type="default"/>
       <w:pgSz w:h="15840" w:w="12240" w:orient="portrait"/>
       <w:pgMar w:bottom="431.99999999999994" w:top="144" w:left="431.99999999999994" w:right="431.99999999999994" w:header="708" w:footer="708"/>
       <w:pgNumType w:start="1"/>

</xml_diff>